<commit_message>
Revision de auditoria 2026-10-10 y documentos regenerados
INFORME_AUDITORIA.md v1.1: estado de los pendientes del 15-sep y hallazgos
LAV-N01 a LAV-N15, sin pasos de reproduccion porque el repositorio es publico.
Avisos de que la retencion mensual de respaldos no funciona (LAV-N05) en el
manual de administrador y en 12_CONTINUIDAD.

PDF y DOCX regenerados de Arquitectura, manual de usuario (2.1), manual de
administrador (2.1), historial de versiones (3.2) y el informe: los .md se
habian actualizado el 08-oct y los PDF seguian siendo del 15 y 27-sep.

Co-Authored-By: Claude Opus 5.5 (1M context) <noreply@anthropic.com>
</commit_message>
<xml_diff>
--- a/INFORME_AUDITORIA.docx
+++ b/INFORME_AUDITORIA.docx
@@ -39,7 +39,19 @@
         <w:pStyle w:val="Subtitle"/>
       </w:pPr>
       <w:r>
-        <w:t xml:space="preserve">LavadoCarros</w:t>
+        <w:t xml:space="preserve">Total</w:t>
+      </w:r>
+      <w:r>
+        <w:t xml:space="preserve"> </w:t>
+      </w:r>
+      <w:r>
+        <w:t xml:space="preserve">Clean</w:t>
+      </w:r>
+      <w:r>
+        <w:t xml:space="preserve"> </w:t>
+      </w:r>
+      <w:r>
+        <w:t xml:space="preserve">Car</w:t>
       </w:r>
     </w:p>
     <w:p>
@@ -91,7 +103,7 @@
         <w:t xml:space="preserve"> </w:t>
       </w:r>
       <w:r>
-        <w:t xml:space="preserve">1.0</w:t>
+        <w:t xml:space="preserve">1.1</w:t>
       </w:r>
       <w:r>
         <w:t xml:space="preserve"> </w:t>
@@ -103,7 +115,7 @@
         <w:t xml:space="preserve"> </w:t>
       </w:r>
       <w:r>
-        <w:t xml:space="preserve">15</w:t>
+        <w:t xml:space="preserve">11</w:t>
       </w:r>
       <w:r>
         <w:t xml:space="preserve"> </w:t>
@@ -115,7 +127,7 @@
         <w:t xml:space="preserve"> </w:t>
       </w:r>
       <w:r>
-        <w:t xml:space="preserve">septiembre</w:t>
+        <w:t xml:space="preserve">octubre</w:t>
       </w:r>
       <w:r>
         <w:t xml:space="preserve"> </w:t>
@@ -171,7 +183,7 @@
         <w:t xml:space="preserve"> </w:t>
       </w:r>
       <w:r>
-        <w:t xml:space="preserve">2026-09-15 ·</w:t>
+        <w:t xml:space="preserve">2026-09-15 (revisado 2026-10-10) ·</w:t>
       </w:r>
       <w:r>
         <w:t xml:space="preserve"> </w:t>
@@ -187,7 +199,7 @@
         <w:t xml:space="preserve"> </w:t>
       </w:r>
       <w:r>
-        <w:t xml:space="preserve">1.0</w:t>
+        <w:t xml:space="preserve">1.1</w:t>
       </w:r>
       <w:r>
         <w:t xml:space="preserve"> </w:t>
@@ -3616,7 +3628,7 @@
       </w:r>
     </w:p>
     <w:bookmarkEnd w:id="40"/>
-    <w:bookmarkStart w:id="41" w:name="control-de-versiones"/>
+    <w:bookmarkStart w:id="46" w:name="revisión-2026-10-10"/>
     <w:p>
       <w:pPr>
         <w:pStyle w:val="Heading2"/>
@@ -3631,7 +3643,887 @@
         <w:tab/>
       </w:r>
       <w:r>
-        <w:t xml:space="preserve">Control de versiones</w:t>
+        <w:t xml:space="preserve">Revisión 2026-10-10</w:t>
+      </w:r>
+    </w:p>
+    <w:p>
+      <w:pPr>
+        <w:pStyle w:val="FirstParagraph"/>
+      </w:pPr>
+      <w:r>
+        <w:rPr>
+          <w:b/>
+          <w:bCs/>
+        </w:rPr>
+        <w:t xml:space="preserve">Version del informe:</w:t>
+      </w:r>
+      <w:r>
+        <w:t xml:space="preserve"> </w:t>
+      </w:r>
+      <w:r>
+        <w:t xml:space="preserve">1.1 ·</w:t>
+      </w:r>
+      <w:r>
+        <w:t xml:space="preserve"> </w:t>
+      </w:r>
+      <w:r>
+        <w:rPr>
+          <w:b/>
+          <w:bCs/>
+        </w:rPr>
+        <w:t xml:space="preserve">Codigo revisado:</w:t>
+      </w:r>
+      <w:r>
+        <w:t xml:space="preserve"> </w:t>
+      </w:r>
+      <w:r>
+        <w:rPr>
+          <w:rStyle w:val="VerbatimChar"/>
+        </w:rPr>
+        <w:t xml:space="preserve">a27181b</w:t>
+      </w:r>
+      <w:r>
+        <w:t xml:space="preserve"> </w:t>
+      </w:r>
+      <w:r>
+        <w:t xml:space="preserve">(2026-10-08) · Solo lectura:</w:t>
+      </w:r>
+      <w:r>
+        <w:t xml:space="preserve"> </w:t>
+      </w:r>
+      <w:r>
+        <w:t xml:space="preserve">no se inicio sesion en la app ni se escribio en la base.</w:t>
+      </w:r>
+    </w:p>
+    <w:p>
+      <w:pPr>
+        <w:pStyle w:val="BlockText"/>
+      </w:pPr>
+      <w:r>
+        <w:t xml:space="preserve">Este repositorio es</w:t>
+      </w:r>
+      <w:r>
+        <w:t xml:space="preserve"> </w:t>
+      </w:r>
+      <w:r>
+        <w:rPr>
+          <w:b/>
+          <w:bCs/>
+        </w:rPr>
+        <w:t xml:space="preserve">publico</w:t>
+      </w:r>
+      <w:r>
+        <w:t xml:space="preserve">. Esta seccion describe cada falla y su correccion, pero</w:t>
+      </w:r>
+      <w:r>
+        <w:t xml:space="preserve"> </w:t>
+      </w:r>
+      <w:r>
+        <w:t xml:space="preserve">omite a proposito los pasos para reproducirla. El detalle tecnico completo esta en la</w:t>
+      </w:r>
+      <w:r>
+        <w:t xml:space="preserve"> </w:t>
+      </w:r>
+      <w:r>
+        <w:t xml:space="preserve">copia interna de la auditoria (</w:t>
+      </w:r>
+      <w:r>
+        <w:rPr>
+          <w:rStyle w:val="VerbatimChar"/>
+        </w:rPr>
+        <w:t xml:space="preserve">Documentos/AUDITORIA-2026-10-10/</w:t>
+      </w:r>
+      <w:r>
+        <w:t xml:space="preserve">, fuera del repo).</w:t>
+      </w:r>
+    </w:p>
+    <w:bookmarkStart w:id="41" w:name="estado-general-critico"/>
+    <w:p>
+      <w:pPr>
+        <w:pStyle w:val="Heading3"/>
+      </w:pPr>
+      <w:r>
+        <w:rPr>
+          <w:rStyle w:val="SectionNumber"/>
+        </w:rPr>
+        <w:t xml:space="preserve">0.18.1</w:t>
+      </w:r>
+      <w:r>
+        <w:tab/>
+      </w:r>
+      <w:r>
+        <w:t xml:space="preserve">Estado general: 🔴 CRITICO</w:t>
+      </w:r>
+    </w:p>
+    <w:p>
+      <w:pPr>
+        <w:pStyle w:val="FirstParagraph"/>
+      </w:pPr>
+      <w:r>
+        <w:t xml:space="preserve">El codigo mejoro mucho desde el 15-sep (helmet, refresh revocable, 203 pruebas, CI,</w:t>
+      </w:r>
+      <w:r>
+        <w:t xml:space="preserve"> </w:t>
+      </w:r>
+      <w:r>
+        <w:t xml:space="preserve">respaldo diario verificado). El estado empeora por la operacion: el panel ya se usa</w:t>
+      </w:r>
+      <w:r>
+        <w:t xml:space="preserve"> </w:t>
+      </w:r>
+      <w:r>
+        <w:t xml:space="preserve">desde Internet por HTTP y siguen vigentes credenciales que estan publicadas.</w:t>
+      </w:r>
+      <w:r>
+        <w:t xml:space="preserve"> </w:t>
+      </w:r>
+      <w:r>
+        <w:t xml:space="preserve">El sistema sigue en piloto: 22 reservas en total, solo 4 desde el 15-sep y ninguna futura.</w:t>
+      </w:r>
+    </w:p>
+    <w:bookmarkEnd w:id="41"/>
+    <w:bookmarkStart w:id="42" w:name="pendientes-del-2026-09-15"/>
+    <w:p>
+      <w:pPr>
+        <w:pStyle w:val="Heading3"/>
+      </w:pPr>
+      <w:r>
+        <w:rPr>
+          <w:rStyle w:val="SectionNumber"/>
+        </w:rPr>
+        <w:t xml:space="preserve">0.18.2</w:t>
+      </w:r>
+      <w:r>
+        <w:tab/>
+      </w:r>
+      <w:r>
+        <w:t xml:space="preserve">Pendientes del 2026-09-15</w:t>
+      </w:r>
+    </w:p>
+    <w:tbl>
+      <w:tblPr>
+        <w:tblStyle w:val="Table"/>
+        <w:tblW w:type="pct" w:w="5000"/>
+        <w:jc w:val="left"/>
+        <w:tblLayout w:type="fixed"/>
+        <w:tblLook w:firstRow="1" w:lastRow="0" w:firstColumn="0" w:lastColumn="0" w:noHBand="0" w:noVBand="0" w:val="0020"/>
+      </w:tblPr>
+      <w:tblGrid>
+        <w:gridCol w:w="2640"/>
+        <w:gridCol w:w="2640"/>
+        <w:gridCol w:w="2640"/>
+      </w:tblGrid>
+      <w:tr>
+        <w:trPr>
+          <w:tblHeader w:val="on"/>
+        </w:trPr>
+        <w:tc>
+          <w:tcPr/>
+          <w:p>
+            <w:pPr>
+              <w:pStyle w:val="Compact"/>
+              <w:jc w:val="left"/>
+            </w:pPr>
+            <w:r>
+              <w:t xml:space="preserve">ID</w:t>
+            </w:r>
+          </w:p>
+        </w:tc>
+        <w:tc>
+          <w:tcPr/>
+          <w:p>
+            <w:pPr>
+              <w:pStyle w:val="Compact"/>
+              <w:jc w:val="left"/>
+            </w:pPr>
+            <w:r>
+              <w:t xml:space="preserve">Tema</w:t>
+            </w:r>
+          </w:p>
+        </w:tc>
+        <w:tc>
+          <w:tcPr/>
+          <w:p>
+            <w:pPr>
+              <w:pStyle w:val="Compact"/>
+              <w:jc w:val="left"/>
+            </w:pPr>
+            <w:r>
+              <w:t xml:space="preserve">Estado al 2026-10-10</w:t>
+            </w:r>
+          </w:p>
+        </w:tc>
+      </w:tr>
+      <w:tr>
+        <w:tc>
+          <w:tcPr/>
+          <w:p>
+            <w:pPr>
+              <w:pStyle w:val="Compact"/>
+              <w:jc w:val="left"/>
+            </w:pPr>
+            <w:r>
+              <w:t xml:space="preserve">CONT-01</w:t>
+            </w:r>
+          </w:p>
+        </w:tc>
+        <w:tc>
+          <w:tcPr/>
+          <w:p>
+            <w:pPr>
+              <w:pStyle w:val="Compact"/>
+              <w:jc w:val="left"/>
+            </w:pPr>
+            <w:r>
+              <w:t xml:space="preserve">Respaldo</w:t>
+            </w:r>
+          </w:p>
+        </w:tc>
+        <w:tc>
+          <w:tcPr/>
+          <w:p>
+            <w:pPr>
+              <w:pStyle w:val="Compact"/>
+              <w:jc w:val="left"/>
+            </w:pPr>
+            <w:r>
+              <w:t xml:space="preserve">🟡 PARCIAL: cron diario con dump verificado y restauracion probada, pero queda en el mismo servidor, falto el del 09-oct (corte del servidor) sin alerta y la retencion mensual no funciona (LAV-N05)</w:t>
+            </w:r>
+          </w:p>
+        </w:tc>
+      </w:tr>
+      <w:tr>
+        <w:tc>
+          <w:tcPr/>
+          <w:p>
+            <w:pPr>
+              <w:pStyle w:val="Compact"/>
+              <w:jc w:val="left"/>
+            </w:pPr>
+            <w:r>
+              <w:t xml:space="preserve">SEC-01</w:t>
+            </w:r>
+          </w:p>
+        </w:tc>
+        <w:tc>
+          <w:tcPr/>
+          <w:p>
+            <w:pPr>
+              <w:pStyle w:val="Compact"/>
+              <w:jc w:val="left"/>
+            </w:pPr>
+            <w:r>
+              <w:t xml:space="preserve">PostgreSQL publicado en todas las interfaces</w:t>
+            </w:r>
+          </w:p>
+        </w:tc>
+        <w:tc>
+          <w:tcPr/>
+          <w:p>
+            <w:pPr>
+              <w:pStyle w:val="Compact"/>
+              <w:jc w:val="left"/>
+            </w:pPr>
+            <w:r>
+              <w:t xml:space="preserve">🔴 ABIERTO y agravado: el usuario de la app es superusuario y su contrasena coincide con la versionada</w:t>
+            </w:r>
+          </w:p>
+        </w:tc>
+      </w:tr>
+      <w:tr>
+        <w:tc>
+          <w:tcPr/>
+          <w:p>
+            <w:pPr>
+              <w:pStyle w:val="Compact"/>
+              <w:jc w:val="left"/>
+            </w:pPr>
+            <w:r>
+              <w:t xml:space="preserve">SEC-02</w:t>
+            </w:r>
+          </w:p>
+        </w:tc>
+        <w:tc>
+          <w:tcPr/>
+          <w:p>
+            <w:pPr>
+              <w:pStyle w:val="Compact"/>
+              <w:jc w:val="left"/>
+            </w:pPr>
+            <w:r>
+              <w:t xml:space="preserve">Webhook de pagos sin firma</w:t>
+            </w:r>
+          </w:p>
+        </w:tc>
+        <w:tc>
+          <w:tcPr/>
+          <w:p>
+            <w:pPr>
+              <w:pStyle w:val="Compact"/>
+              <w:jc w:val="left"/>
+            </w:pPr>
+            <w:r>
+              <w:t xml:space="preserve">🔴 ABIERTO y ya aprovechable (LAV-N01)</w:t>
+            </w:r>
+          </w:p>
+        </w:tc>
+      </w:tr>
+      <w:tr>
+        <w:tc>
+          <w:tcPr/>
+          <w:p>
+            <w:pPr>
+              <w:pStyle w:val="Compact"/>
+              <w:jc w:val="left"/>
+            </w:pPr>
+            <w:r>
+              <w:t xml:space="preserve">SEC-03</w:t>
+            </w:r>
+          </w:p>
+        </w:tc>
+        <w:tc>
+          <w:tcPr/>
+          <w:p>
+            <w:pPr>
+              <w:pStyle w:val="Compact"/>
+              <w:jc w:val="left"/>
+            </w:pPr>
+            <w:r>
+              <w:t xml:space="preserve">Swagger publico</w:t>
+            </w:r>
+          </w:p>
+        </w:tc>
+        <w:tc>
+          <w:tcPr/>
+          <w:p>
+            <w:pPr>
+              <w:pStyle w:val="Compact"/>
+              <w:jc w:val="left"/>
+            </w:pPr>
+            <w:r>
+              <w:t xml:space="preserve">🟠 ABIERTO, ahora tambien desde Internet</w:t>
+            </w:r>
+          </w:p>
+        </w:tc>
+      </w:tr>
+      <w:tr>
+        <w:tc>
+          <w:tcPr/>
+          <w:p>
+            <w:pPr>
+              <w:pStyle w:val="Compact"/>
+              <w:jc w:val="left"/>
+            </w:pPr>
+            <w:r>
+              <w:t xml:space="preserve">SEC-04</w:t>
+            </w:r>
+          </w:p>
+        </w:tc>
+        <w:tc>
+          <w:tcPr/>
+          <w:p>
+            <w:pPr>
+              <w:pStyle w:val="Compact"/>
+              <w:jc w:val="left"/>
+            </w:pPr>
+            <w:r>
+              <w:t xml:space="preserve">CORS refleja cualquier origen</w:t>
+            </w:r>
+          </w:p>
+        </w:tc>
+        <w:tc>
+          <w:tcPr/>
+          <w:p>
+            <w:pPr>
+              <w:pStyle w:val="Compact"/>
+              <w:jc w:val="left"/>
+            </w:pPr>
+            <w:r>
+              <w:t xml:space="preserve">🟡 ABIERTO (impacto bajo: la sesion va por Bearer)</w:t>
+            </w:r>
+          </w:p>
+        </w:tc>
+      </w:tr>
+      <w:tr>
+        <w:tc>
+          <w:tcPr/>
+          <w:p>
+            <w:pPr>
+              <w:pStyle w:val="Compact"/>
+              <w:jc w:val="left"/>
+            </w:pPr>
+            <w:r>
+              <w:t xml:space="preserve">SEC-05/06</w:t>
+            </w:r>
+          </w:p>
+        </w:tc>
+        <w:tc>
+          <w:tcPr/>
+          <w:p>
+            <w:pPr>
+              <w:pStyle w:val="Compact"/>
+              <w:jc w:val="left"/>
+            </w:pPr>
+            <w:r>
+              <w:t xml:space="preserve">helmet, X-Powered-By</w:t>
+            </w:r>
+          </w:p>
+        </w:tc>
+        <w:tc>
+          <w:tcPr/>
+          <w:p>
+            <w:pPr>
+              <w:pStyle w:val="Compact"/>
+              <w:jc w:val="left"/>
+            </w:pPr>
+            <w:r>
+              <w:t xml:space="preserve">🟢 CERRADO en el backend; el HTML del frontend sigue sin CSP</w:t>
+            </w:r>
+          </w:p>
+        </w:tc>
+      </w:tr>
+      <w:tr>
+        <w:tc>
+          <w:tcPr/>
+          <w:p>
+            <w:pPr>
+              <w:pStyle w:val="Compact"/>
+              <w:jc w:val="left"/>
+            </w:pPr>
+            <w:r>
+              <w:t xml:space="preserve">SEC-07</w:t>
+            </w:r>
+          </w:p>
+        </w:tc>
+        <w:tc>
+          <w:tcPr/>
+          <w:p>
+            <w:pPr>
+              <w:pStyle w:val="Compact"/>
+              <w:jc w:val="left"/>
+            </w:pPr>
+            <w:r>
+              <w:rPr>
+                <w:rStyle w:val="VerbatimChar"/>
+              </w:rPr>
+              <w:t xml:space="preserve">rol</w:t>
+            </w:r>
+            <w:r>
+              <w:t xml:space="preserve"> </w:t>
+            </w:r>
+            <w:r>
+              <w:t xml:space="preserve">como texto libre</w:t>
+            </w:r>
+          </w:p>
+        </w:tc>
+        <w:tc>
+          <w:tcPr/>
+          <w:p>
+            <w:pPr>
+              <w:pStyle w:val="Compact"/>
+              <w:jc w:val="left"/>
+            </w:pPr>
+            <w:r>
+              <w:t xml:space="preserve">🟡 ABIERTO</w:t>
+            </w:r>
+          </w:p>
+        </w:tc>
+      </w:tr>
+      <w:tr>
+        <w:tc>
+          <w:tcPr/>
+          <w:p>
+            <w:pPr>
+              <w:pStyle w:val="Compact"/>
+              <w:jc w:val="left"/>
+            </w:pPr>
+            <w:r>
+              <w:t xml:space="preserve">SEC-08</w:t>
+            </w:r>
+          </w:p>
+        </w:tc>
+        <w:tc>
+          <w:tcPr/>
+          <w:p>
+            <w:pPr>
+              <w:pStyle w:val="Compact"/>
+              <w:jc w:val="left"/>
+            </w:pPr>
+            <w:r>
+              <w:t xml:space="preserve">Cuerpo JSON de 20 MB</w:t>
+            </w:r>
+          </w:p>
+        </w:tc>
+        <w:tc>
+          <w:tcPr/>
+          <w:p>
+            <w:pPr>
+              <w:pStyle w:val="Compact"/>
+              <w:jc w:val="left"/>
+            </w:pPr>
+            <w:r>
+              <w:t xml:space="preserve">🔵 ABIERTO en el puerto directo del backend</w:t>
+            </w:r>
+          </w:p>
+        </w:tc>
+      </w:tr>
+      <w:tr>
+        <w:tc>
+          <w:tcPr/>
+          <w:p>
+            <w:pPr>
+              <w:pStyle w:val="Compact"/>
+              <w:jc w:val="left"/>
+            </w:pPr>
+            <w:r>
+              <w:t xml:space="preserve">SEC-10</w:t>
+            </w:r>
+          </w:p>
+        </w:tc>
+        <w:tc>
+          <w:tcPr/>
+          <w:p>
+            <w:pPr>
+              <w:pStyle w:val="Compact"/>
+              <w:jc w:val="left"/>
+            </w:pPr>
+            <w:r>
+              <w:t xml:space="preserve">Sin HTTPS</w:t>
+            </w:r>
+          </w:p>
+        </w:tc>
+        <w:tc>
+          <w:tcPr/>
+          <w:p>
+            <w:pPr>
+              <w:pStyle w:val="Compact"/>
+              <w:jc w:val="left"/>
+            </w:pPr>
+            <w:r>
+              <w:t xml:space="preserve">⚪ El APK en claro es una</w:t>
+            </w:r>
+            <w:r>
+              <w:t xml:space="preserve"> </w:t>
+            </w:r>
+            <w:r>
+              <w:rPr>
+                <w:b/>
+                <w:bCs/>
+              </w:rPr>
+              <w:t xml:space="preserve">decision aceptada</w:t>
+            </w:r>
+            <w:r>
+              <w:t xml:space="preserve">. Por el mismo canal viajan el login del panel y el refresh de 7 dias</w:t>
+            </w:r>
+          </w:p>
+        </w:tc>
+      </w:tr>
+      <w:tr>
+        <w:tc>
+          <w:tcPr/>
+          <w:p>
+            <w:pPr>
+              <w:pStyle w:val="Compact"/>
+              <w:jc w:val="left"/>
+            </w:pPr>
+            <w:r>
+              <w:t xml:space="preserve">OPS-01</w:t>
+            </w:r>
+          </w:p>
+        </w:tc>
+        <w:tc>
+          <w:tcPr/>
+          <w:p>
+            <w:pPr>
+              <w:pStyle w:val="Compact"/>
+              <w:jc w:val="left"/>
+            </w:pPr>
+            <w:r>
+              <w:t xml:space="preserve">Healthchecks</w:t>
+            </w:r>
+          </w:p>
+        </w:tc>
+        <w:tc>
+          <w:tcPr/>
+          <w:p>
+            <w:pPr>
+              <w:pStyle w:val="Compact"/>
+              <w:jc w:val="left"/>
+            </w:pPr>
+            <w:r>
+              <w:t xml:space="preserve">🟡 ABIERTO: en el arranque del 09-oct nginx murio antes que el backend y solo volvio por el reinicio automatico</w:t>
+            </w:r>
+          </w:p>
+        </w:tc>
+      </w:tr>
+      <w:tr>
+        <w:tc>
+          <w:tcPr/>
+          <w:p>
+            <w:pPr>
+              <w:pStyle w:val="Compact"/>
+              <w:jc w:val="left"/>
+            </w:pPr>
+            <w:r>
+              <w:t xml:space="preserve">OPS-03</w:t>
+            </w:r>
+          </w:p>
+        </w:tc>
+        <w:tc>
+          <w:tcPr/>
+          <w:p>
+            <w:pPr>
+              <w:pStyle w:val="Compact"/>
+              <w:jc w:val="left"/>
+            </w:pPr>
+            <w:r>
+              <w:t xml:space="preserve">Archivos de root</w:t>
+            </w:r>
+          </w:p>
+        </w:tc>
+        <w:tc>
+          <w:tcPr/>
+          <w:p>
+            <w:pPr>
+              <w:pStyle w:val="Compact"/>
+              <w:jc w:val="left"/>
+            </w:pPr>
+            <w:r>
+              <w:t xml:space="preserve">🟢 CERRADO</w:t>
+            </w:r>
+          </w:p>
+        </w:tc>
+      </w:tr>
+      <w:tr>
+        <w:tc>
+          <w:tcPr/>
+          <w:p>
+            <w:pPr>
+              <w:pStyle w:val="Compact"/>
+              <w:jc w:val="left"/>
+            </w:pPr>
+            <w:r>
+              <w:t xml:space="preserve">GES-01</w:t>
+            </w:r>
+          </w:p>
+        </w:tc>
+        <w:tc>
+          <w:tcPr/>
+          <w:p>
+            <w:pPr>
+              <w:pStyle w:val="Compact"/>
+              <w:jc w:val="left"/>
+            </w:pPr>
+            <w:r>
+              <w:t xml:space="preserve">Sin remoto git</w:t>
+            </w:r>
+          </w:p>
+        </w:tc>
+        <w:tc>
+          <w:tcPr/>
+          <w:p>
+            <w:pPr>
+              <w:pStyle w:val="Compact"/>
+              <w:jc w:val="left"/>
+            </w:pPr>
+            <w:r>
+              <w:t xml:space="preserve">🟢 Resuelto, pero el remoto es</w:t>
+            </w:r>
+            <w:r>
+              <w:t xml:space="preserve"> </w:t>
+            </w:r>
+            <w:r>
+              <w:rPr>
+                <w:b/>
+                <w:bCs/>
+              </w:rPr>
+              <w:t xml:space="preserve">publico</w:t>
+            </w:r>
+          </w:p>
+        </w:tc>
+      </w:tr>
+      <w:tr>
+        <w:tc>
+          <w:tcPr/>
+          <w:p>
+            <w:pPr>
+              <w:pStyle w:val="Compact"/>
+              <w:jc w:val="left"/>
+            </w:pPr>
+            <w:r>
+              <w:t xml:space="preserve">—</w:t>
+            </w:r>
+          </w:p>
+        </w:tc>
+        <w:tc>
+          <w:tcPr/>
+          <w:p>
+            <w:pPr>
+              <w:pStyle w:val="Compact"/>
+              <w:jc w:val="left"/>
+            </w:pPr>
+            <w:r>
+              <w:t xml:space="preserve">Cuentas del seed</w:t>
+            </w:r>
+          </w:p>
+        </w:tc>
+        <w:tc>
+          <w:tcPr/>
+          <w:p>
+            <w:pPr>
+              <w:pStyle w:val="Compact"/>
+              <w:jc w:val="left"/>
+            </w:pPr>
+            <w:r>
+              <w:t xml:space="preserve">🔴 Las 4 cuentas del seed (admin incluida) siguen con la contrasena del seed</w:t>
+            </w:r>
+          </w:p>
+        </w:tc>
+      </w:tr>
+      <w:tr>
+        <w:tc>
+          <w:tcPr/>
+          <w:p>
+            <w:pPr>
+              <w:pStyle w:val="Compact"/>
+              <w:jc w:val="left"/>
+            </w:pPr>
+            <w:r>
+              <w:t xml:space="preserve">—</w:t>
+            </w:r>
+          </w:p>
+        </w:tc>
+        <w:tc>
+          <w:tcPr/>
+          <w:p>
+            <w:pPr>
+              <w:pStyle w:val="Compact"/>
+              <w:jc w:val="left"/>
+            </w:pPr>
+            <w:r>
+              <w:t xml:space="preserve">Precios de moto / adicionales</w:t>
+            </w:r>
+          </w:p>
+        </w:tc>
+        <w:tc>
+          <w:tcPr/>
+          <w:p>
+            <w:pPr>
+              <w:pStyle w:val="Compact"/>
+              <w:jc w:val="left"/>
+            </w:pPr>
+            <w:r>
+              <w:t xml:space="preserve">🟠 Siguen sin cargar</w:t>
+            </w:r>
+          </w:p>
+        </w:tc>
+      </w:tr>
+      <w:tr>
+        <w:tc>
+          <w:tcPr/>
+          <w:p>
+            <w:pPr>
+              <w:pStyle w:val="Compact"/>
+              <w:jc w:val="left"/>
+            </w:pPr>
+            <w:r>
+              <w:t xml:space="preserve">—</w:t>
+            </w:r>
+          </w:p>
+        </w:tc>
+        <w:tc>
+          <w:tcPr/>
+          <w:p>
+            <w:pPr>
+              <w:pStyle w:val="Compact"/>
+              <w:jc w:val="left"/>
+            </w:pPr>
+            <w:r>
+              <w:t xml:space="preserve">Boton</w:t>
+            </w:r>
+            <w:r>
+              <w:t xml:space="preserve"> </w:t>
+            </w:r>
+            <w:r>
+              <w:t xml:space="preserve">“</w:t>
+            </w:r>
+            <w:r>
+              <w:t xml:space="preserve">no asistio</w:t>
+            </w:r>
+            <w:r>
+              <w:t xml:space="preserve">”</w:t>
+            </w:r>
+          </w:p>
+        </w:tc>
+        <w:tc>
+          <w:tcPr/>
+          <w:p>
+            <w:pPr>
+              <w:pStyle w:val="Compact"/>
+              <w:jc w:val="left"/>
+            </w:pPr>
+            <w:r>
+              <w:t xml:space="preserve">🟡 La API existe; ningun boton la llama</w:t>
+            </w:r>
+          </w:p>
+        </w:tc>
+      </w:tr>
+      <w:tr>
+        <w:tc>
+          <w:tcPr/>
+          <w:p>
+            <w:pPr>
+              <w:pStyle w:val="Compact"/>
+              <w:jc w:val="left"/>
+            </w:pPr>
+            <w:r>
+              <w:t xml:space="preserve">—</w:t>
+            </w:r>
+          </w:p>
+        </w:tc>
+        <w:tc>
+          <w:tcPr/>
+          <w:p>
+            <w:pPr>
+              <w:pStyle w:val="Compact"/>
+              <w:jc w:val="left"/>
+            </w:pPr>
+            <w:r>
+              <w:t xml:space="preserve">Correo y Twilio</w:t>
+            </w:r>
+          </w:p>
+        </w:tc>
+        <w:tc>
+          <w:tcPr/>
+          <w:p>
+            <w:pPr>
+              <w:pStyle w:val="Compact"/>
+              <w:jc w:val="left"/>
+            </w:pPr>
+            <w:r>
+              <w:t xml:space="preserve">🟡 Sin configurar: no sale ninguna notificacion</w:t>
+            </w:r>
+          </w:p>
+        </w:tc>
+      </w:tr>
+    </w:tbl>
+    <w:bookmarkEnd w:id="42"/>
+    <w:bookmarkStart w:id="43" w:name="hallazgos-nuevos"/>
+    <w:p>
+      <w:pPr>
+        <w:pStyle w:val="Heading3"/>
+      </w:pPr>
+      <w:r>
+        <w:rPr>
+          <w:rStyle w:val="SectionNumber"/>
+        </w:rPr>
+        <w:t xml:space="preserve">0.18.3</w:t>
+      </w:r>
+      <w:r>
+        <w:tab/>
+      </w:r>
+      <w:r>
+        <w:t xml:space="preserve">Hallazgos nuevos</w:t>
       </w:r>
     </w:p>
     <w:tbl>
@@ -3660,43 +4552,43 @@
               <w:jc w:val="left"/>
             </w:pPr>
             <w:r>
-              <w:t xml:space="preserve">Version</w:t>
-            </w:r>
-          </w:p>
-        </w:tc>
-        <w:tc>
-          <w:tcPr/>
-          <w:p>
-            <w:pPr>
-              <w:pStyle w:val="Compact"/>
-              <w:jc w:val="left"/>
-            </w:pPr>
-            <w:r>
-              <w:t xml:space="preserve">Fecha</w:t>
-            </w:r>
-          </w:p>
-        </w:tc>
-        <w:tc>
-          <w:tcPr/>
-          <w:p>
-            <w:pPr>
-              <w:pStyle w:val="Compact"/>
-              <w:jc w:val="left"/>
-            </w:pPr>
-            <w:r>
-              <w:t xml:space="preserve">Cambio</w:t>
-            </w:r>
-          </w:p>
-        </w:tc>
-        <w:tc>
-          <w:tcPr/>
-          <w:p>
-            <w:pPr>
-              <w:pStyle w:val="Compact"/>
-              <w:jc w:val="left"/>
-            </w:pPr>
-            <w:r>
-              <w:t xml:space="preserve">Responsable</w:t>
+              <w:t xml:space="preserve">ID</w:t>
+            </w:r>
+          </w:p>
+        </w:tc>
+        <w:tc>
+          <w:tcPr/>
+          <w:p>
+            <w:pPr>
+              <w:pStyle w:val="Compact"/>
+              <w:jc w:val="left"/>
+            </w:pPr>
+            <w:r>
+              <w:t xml:space="preserve">Sev.</w:t>
+            </w:r>
+          </w:p>
+        </w:tc>
+        <w:tc>
+          <w:tcPr/>
+          <w:p>
+            <w:pPr>
+              <w:pStyle w:val="Compact"/>
+              <w:jc w:val="left"/>
+            </w:pPr>
+            <w:r>
+              <w:t xml:space="preserve">Hallazgo</w:t>
+            </w:r>
+          </w:p>
+        </w:tc>
+        <w:tc>
+          <w:tcPr/>
+          <w:p>
+            <w:pPr>
+              <w:pStyle w:val="Compact"/>
+              <w:jc w:val="left"/>
+            </w:pPr>
+            <w:r>
+              <w:t xml:space="preserve">Correccion</w:t>
             </w:r>
           </w:p>
         </w:tc>
@@ -3710,48 +4602,1999 @@
               <w:jc w:val="left"/>
             </w:pPr>
             <w:r>
-              <w:t xml:space="preserve">1.0</w:t>
-            </w:r>
-          </w:p>
-        </w:tc>
-        <w:tc>
-          <w:tcPr/>
-          <w:p>
-            <w:pPr>
-              <w:pStyle w:val="Compact"/>
-              <w:jc w:val="left"/>
-            </w:pPr>
-            <w:r>
-              <w:t xml:space="preserve">2026-09-15</w:t>
-            </w:r>
-          </w:p>
-        </w:tc>
-        <w:tc>
-          <w:tcPr/>
-          <w:p>
-            <w:pPr>
-              <w:pStyle w:val="Compact"/>
-              <w:jc w:val="left"/>
-            </w:pPr>
-            <w:r>
-              <w:t xml:space="preserve">Emision inicial del documento.</w:t>
-            </w:r>
-          </w:p>
-        </w:tc>
-        <w:tc>
-          <w:tcPr/>
-          <w:p>
-            <w:pPr>
-              <w:pStyle w:val="Compact"/>
-              <w:jc w:val="left"/>
-            </w:pPr>
-            <w:r>
-              <w:t xml:space="preserve">Auditoria tecnica</w:t>
+              <w:t xml:space="preserve">LAV-N01</w:t>
+            </w:r>
+          </w:p>
+        </w:tc>
+        <w:tc>
+          <w:tcPr/>
+          <w:p>
+            <w:pPr>
+              <w:pStyle w:val="Compact"/>
+              <w:jc w:val="left"/>
+            </w:pPr>
+            <w:r>
+              <w:t xml:space="preserve">🔴</w:t>
+            </w:r>
+          </w:p>
+        </w:tc>
+        <w:tc>
+          <w:tcPr/>
+          <w:p>
+            <w:pPr>
+              <w:pStyle w:val="Compact"/>
+              <w:jc w:val="left"/>
+            </w:pPr>
+            <w:r>
+              <w:t xml:space="preserve">Un cliente puede dejar como</w:t>
+            </w:r>
+            <w:r>
+              <w:t xml:space="preserve"> </w:t>
+            </w:r>
+            <w:r>
+              <w:rPr>
+                <w:b/>
+                <w:bCs/>
+              </w:rPr>
+              <w:t xml:space="preserve">pagada</w:t>
+            </w:r>
+            <w:r>
+              <w:t xml:space="preserve"> </w:t>
+            </w:r>
+            <w:r>
+              <w:t xml:space="preserve">su propia reserva, por el flujo de pago con tarjeta y el webhook sin firma</w:t>
+            </w:r>
+          </w:p>
+        </w:tc>
+        <w:tc>
+          <w:tcPr/>
+          <w:p>
+            <w:pPr>
+              <w:pStyle w:val="Compact"/>
+              <w:jc w:val="left"/>
+            </w:pPr>
+            <w:r>
+              <w:t xml:space="preserve">Deshabilitar webhook y pago con tarjeta mientras no haya pasarela; al conectarla, firma HMAC del proveedor, no exponer la referencia interna y conciliar el monto</w:t>
+            </w:r>
+          </w:p>
+        </w:tc>
+      </w:tr>
+      <w:tr>
+        <w:tc>
+          <w:tcPr/>
+          <w:p>
+            <w:pPr>
+              <w:pStyle w:val="Compact"/>
+              <w:jc w:val="left"/>
+            </w:pPr>
+            <w:r>
+              <w:t xml:space="preserve">LAV-N02</w:t>
+            </w:r>
+          </w:p>
+        </w:tc>
+        <w:tc>
+          <w:tcPr/>
+          <w:p>
+            <w:pPr>
+              <w:pStyle w:val="Compact"/>
+              <w:jc w:val="left"/>
+            </w:pPr>
+            <w:r>
+              <w:t xml:space="preserve">🔴</w:t>
+            </w:r>
+          </w:p>
+        </w:tc>
+        <w:tc>
+          <w:tcPr/>
+          <w:p>
+            <w:pPr>
+              <w:pStyle w:val="Compact"/>
+              <w:jc w:val="left"/>
+            </w:pPr>
+            <w:r>
+              <w:t xml:space="preserve">Credenciales reales (seed y base de datos) en el repositorio publico, y defaults de BD y JWT en</w:t>
+            </w:r>
+            <w:r>
+              <w:t xml:space="preserve"> </w:t>
+            </w:r>
+            <w:r>
+              <w:rPr>
+                <w:rStyle w:val="VerbatimChar"/>
+              </w:rPr>
+              <w:t xml:space="preserve">config/index.js</w:t>
+            </w:r>
+          </w:p>
+        </w:tc>
+        <w:tc>
+          <w:tcPr/>
+          <w:p>
+            <w:pPr>
+              <w:pStyle w:val="Compact"/>
+              <w:jc w:val="left"/>
+            </w:pPr>
+            <w:r>
+              <w:t xml:space="preserve">Rotar las 4 cuentas del seed y la clave de PostgreSQL; publicar 5437 solo en</w:t>
+            </w:r>
+            <w:r>
+              <w:t xml:space="preserve"> </w:t>
+            </w:r>
+            <w:r>
+              <w:rPr>
+                <w:rStyle w:val="VerbatimChar"/>
+              </w:rPr>
+              <w:t xml:space="preserve">127.0.0.1</w:t>
+            </w:r>
+            <w:r>
+              <w:t xml:space="preserve">; repo privado; quitar valores reales de los ejemplos y defaults del codigo</w:t>
+            </w:r>
+          </w:p>
+        </w:tc>
+      </w:tr>
+      <w:tr>
+        <w:tc>
+          <w:tcPr/>
+          <w:p>
+            <w:pPr>
+              <w:pStyle w:val="Compact"/>
+              <w:jc w:val="left"/>
+            </w:pPr>
+            <w:r>
+              <w:t xml:space="preserve">LAV-N03</w:t>
+            </w:r>
+          </w:p>
+        </w:tc>
+        <w:tc>
+          <w:tcPr/>
+          <w:p>
+            <w:pPr>
+              <w:pStyle w:val="Compact"/>
+              <w:jc w:val="left"/>
+            </w:pPr>
+            <w:r>
+              <w:t xml:space="preserve">🟠</w:t>
+            </w:r>
+          </w:p>
+        </w:tc>
+        <w:tc>
+          <w:tcPr/>
+          <w:p>
+            <w:pPr>
+              <w:pStyle w:val="Compact"/>
+              <w:jc w:val="left"/>
+            </w:pPr>
+            <w:r>
+              <w:t xml:space="preserve">nginx corta toda subida de mas de 1 MB (falta</w:t>
+            </w:r>
+            <w:r>
+              <w:t xml:space="preserve"> </w:t>
+            </w:r>
+            <w:r>
+              <w:rPr>
+                <w:rStyle w:val="VerbatimChar"/>
+              </w:rPr>
+              <w:t xml:space="preserve">client_max_body_size</w:t>
+            </w:r>
+            <w:r>
+              <w:t xml:space="preserve">): fotos de celular y comprobantes fallan</w:t>
+            </w:r>
+          </w:p>
+        </w:tc>
+        <w:tc>
+          <w:tcPr/>
+          <w:p>
+            <w:pPr>
+              <w:pStyle w:val="Compact"/>
+              <w:jc w:val="left"/>
+            </w:pPr>
+            <w:r>
+              <w:rPr>
+                <w:rStyle w:val="VerbatimChar"/>
+              </w:rPr>
+              <w:t xml:space="preserve">client_max_body_size 32m</w:t>
+            </w:r>
+            <w:r>
+              <w:t xml:space="preserve"> </w:t>
+            </w:r>
+            <w:r>
+              <w:t xml:space="preserve">en</w:t>
+            </w:r>
+            <w:r>
+              <w:t xml:space="preserve"> </w:t>
+            </w:r>
+            <w:r>
+              <w:rPr>
+                <w:rStyle w:val="VerbatimChar"/>
+              </w:rPr>
+              <w:t xml:space="preserve">/api/</w:t>
+            </w:r>
+            <w:r>
+              <w:t xml:space="preserve"> </w:t>
+            </w:r>
+            <w:r>
+              <w:t xml:space="preserve">y redimensionar en el cliente</w:t>
+            </w:r>
+          </w:p>
+        </w:tc>
+      </w:tr>
+      <w:tr>
+        <w:tc>
+          <w:tcPr/>
+          <w:p>
+            <w:pPr>
+              <w:pStyle w:val="Compact"/>
+              <w:jc w:val="left"/>
+            </w:pPr>
+            <w:r>
+              <w:t xml:space="preserve">LAV-N04</w:t>
+            </w:r>
+          </w:p>
+        </w:tc>
+        <w:tc>
+          <w:tcPr/>
+          <w:p>
+            <w:pPr>
+              <w:pStyle w:val="Compact"/>
+              <w:jc w:val="left"/>
+            </w:pPr>
+            <w:r>
+              <w:t xml:space="preserve">🟠</w:t>
+            </w:r>
+          </w:p>
+        </w:tc>
+        <w:tc>
+          <w:tcPr/>
+          <w:p>
+            <w:pPr>
+              <w:pStyle w:val="Compact"/>
+              <w:jc w:val="left"/>
+            </w:pPr>
+            <w:r>
+              <w:t xml:space="preserve">“</w:t>
+            </w:r>
+            <w:r>
+              <w:t xml:space="preserve">Cobrado</w:t>
+            </w:r>
+            <w:r>
+              <w:t xml:space="preserve">”</w:t>
+            </w:r>
+            <w:r>
+              <w:t xml:space="preserve"> </w:t>
+            </w:r>
+            <w:r>
+              <w:t xml:space="preserve">del mes pierde lo cobrado el ultimo dia (rango en UTC contra instantes)</w:t>
+            </w:r>
+          </w:p>
+        </w:tc>
+        <w:tc>
+          <w:tcPr/>
+          <w:p>
+            <w:pPr>
+              <w:pStyle w:val="Compact"/>
+              <w:jc w:val="left"/>
+            </w:pPr>
+            <w:r>
+              <w:t xml:space="preserve">Rango</w:t>
+            </w:r>
+            <w:r>
+              <w:t xml:space="preserve"> </w:t>
+            </w:r>
+            <w:r>
+              <w:rPr>
+                <w:rStyle w:val="VerbatimChar"/>
+              </w:rPr>
+              <w:t xml:space="preserve">[desde 00:00 EC, hasta+1 00:00 EC)</w:t>
+            </w:r>
+            <w:r>
+              <w:t xml:space="preserve"> </w:t>
+            </w:r>
+            <w:r>
+              <w:t xml:space="preserve">y prueba con un pago a media tarde del ultimo dia</w:t>
+            </w:r>
+          </w:p>
+        </w:tc>
+      </w:tr>
+      <w:tr>
+        <w:tc>
+          <w:tcPr/>
+          <w:p>
+            <w:pPr>
+              <w:pStyle w:val="Compact"/>
+              <w:jc w:val="left"/>
+            </w:pPr>
+            <w:r>
+              <w:t xml:space="preserve">LAV-N05</w:t>
+            </w:r>
+          </w:p>
+        </w:tc>
+        <w:tc>
+          <w:tcPr/>
+          <w:p>
+            <w:pPr>
+              <w:pStyle w:val="Compact"/>
+              <w:jc w:val="left"/>
+            </w:pPr>
+            <w:r>
+              <w:t xml:space="preserve">🟠</w:t>
+            </w:r>
+          </w:p>
+        </w:tc>
+        <w:tc>
+          <w:tcPr/>
+          <w:p>
+            <w:pPr>
+              <w:pStyle w:val="Compact"/>
+              <w:jc w:val="left"/>
+            </w:pPr>
+            <w:r>
+              <w:t xml:space="preserve">La retencion mensual de respaldos nunca se activa (</w:t>
+            </w:r>
+            <w:r>
+              <w:rPr>
+                <w:rStyle w:val="VerbatimChar"/>
+              </w:rPr>
+              <w:t xml:space="preserve">respaldo.sh:321</w:t>
+            </w:r>
+            <w:r>
+              <w:t xml:space="preserve">)</w:t>
+            </w:r>
+          </w:p>
+        </w:tc>
+        <w:tc>
+          <w:tcPr/>
+          <w:p>
+            <w:pPr>
+              <w:pStyle w:val="Compact"/>
+              <w:jc w:val="left"/>
+            </w:pPr>
+            <w:r>
+              <w:t xml:space="preserve">Leer bien el dia y conservar el primer paquete de cada mes</w:t>
+            </w:r>
+          </w:p>
+        </w:tc>
+      </w:tr>
+      <w:tr>
+        <w:tc>
+          <w:tcPr/>
+          <w:p>
+            <w:pPr>
+              <w:pStyle w:val="Compact"/>
+              <w:jc w:val="left"/>
+            </w:pPr>
+            <w:r>
+              <w:t xml:space="preserve">LAV-N06</w:t>
+            </w:r>
+          </w:p>
+        </w:tc>
+        <w:tc>
+          <w:tcPr/>
+          <w:p>
+            <w:pPr>
+              <w:pStyle w:val="Compact"/>
+              <w:jc w:val="left"/>
+            </w:pPr>
+            <w:r>
+              <w:t xml:space="preserve">🟡</w:t>
+            </w:r>
+          </w:p>
+        </w:tc>
+        <w:tc>
+          <w:tcPr/>
+          <w:p>
+            <w:pPr>
+              <w:pStyle w:val="Compact"/>
+              <w:jc w:val="left"/>
+            </w:pPr>
+            <w:r>
+              <w:t xml:space="preserve">El Excel/PDF de un mes trae la hoja Resumen del mes en curso</w:t>
+            </w:r>
+          </w:p>
+        </w:tc>
+        <w:tc>
+          <w:tcPr/>
+          <w:p>
+            <w:pPr>
+              <w:pStyle w:val="Compact"/>
+              <w:jc w:val="left"/>
+            </w:pPr>
+            <w:r>
+              <w:t xml:space="preserve">Usar el resumen del periodo</w:t>
+            </w:r>
+          </w:p>
+        </w:tc>
+      </w:tr>
+      <w:tr>
+        <w:tc>
+          <w:tcPr/>
+          <w:p>
+            <w:pPr>
+              <w:pStyle w:val="Compact"/>
+              <w:jc w:val="left"/>
+            </w:pPr>
+            <w:r>
+              <w:t xml:space="preserve">LAV-N07</w:t>
+            </w:r>
+          </w:p>
+        </w:tc>
+        <w:tc>
+          <w:tcPr/>
+          <w:p>
+            <w:pPr>
+              <w:pStyle w:val="Compact"/>
+              <w:jc w:val="left"/>
+            </w:pPr>
+            <w:r>
+              <w:t xml:space="preserve">🟡</w:t>
+            </w:r>
+          </w:p>
+        </w:tc>
+        <w:tc>
+          <w:tcPr/>
+          <w:p>
+            <w:pPr>
+              <w:pStyle w:val="Compact"/>
+              <w:jc w:val="left"/>
+            </w:pPr>
+            <w:r>
+              <w:t xml:space="preserve">KPIs del Dashboard sin techo de fecha y con criterios de estado distintos entre pantallas; 18 reservas pasadas siguen abiertas</w:t>
+            </w:r>
+          </w:p>
+        </w:tc>
+        <w:tc>
+          <w:tcPr/>
+          <w:p>
+            <w:pPr>
+              <w:pStyle w:val="Compact"/>
+              <w:jc w:val="left"/>
+            </w:pPr>
+            <w:r>
+              <w:t xml:space="preserve">Rango cerrado y un solo criterio de</w:t>
+            </w:r>
+            <w:r>
+              <w:t xml:space="preserve"> </w:t>
+            </w:r>
+            <w:r>
+              <w:t xml:space="preserve">“</w:t>
+            </w:r>
+            <w:r>
+              <w:t xml:space="preserve">lavado hecho</w:t>
+            </w:r>
+            <w:r>
+              <w:t xml:space="preserve">”</w:t>
+            </w:r>
+          </w:p>
+        </w:tc>
+      </w:tr>
+      <w:tr>
+        <w:tc>
+          <w:tcPr/>
+          <w:p>
+            <w:pPr>
+              <w:pStyle w:val="Compact"/>
+              <w:jc w:val="left"/>
+            </w:pPr>
+            <w:r>
+              <w:t xml:space="preserve">LAV-N08</w:t>
+            </w:r>
+          </w:p>
+        </w:tc>
+        <w:tc>
+          <w:tcPr/>
+          <w:p>
+            <w:pPr>
+              <w:pStyle w:val="Compact"/>
+              <w:jc w:val="left"/>
+            </w:pPr>
+            <w:r>
+              <w:t xml:space="preserve">🟡</w:t>
+            </w:r>
+          </w:p>
+        </w:tc>
+        <w:tc>
+          <w:tcPr/>
+          <w:p>
+            <w:pPr>
+              <w:pStyle w:val="Compact"/>
+              <w:jc w:val="left"/>
+            </w:pPr>
+            <w:r>
+              <w:t xml:space="preserve">Admin y operador no pueden cambiar su contrasena desde la app</w:t>
+            </w:r>
+          </w:p>
+        </w:tc>
+        <w:tc>
+          <w:tcPr/>
+          <w:p>
+            <w:pPr>
+              <w:pStyle w:val="Compact"/>
+              <w:jc w:val="left"/>
+            </w:pPr>
+            <w:r>
+              <w:t xml:space="preserve">“</w:t>
+            </w:r>
+            <w:r>
+              <w:t xml:space="preserve">Cambiar mi contrasena</w:t>
+            </w:r>
+            <w:r>
+              <w:t xml:space="preserve">”</w:t>
+            </w:r>
+            <w:r>
+              <w:t xml:space="preserve"> </w:t>
+            </w:r>
+            <w:r>
+              <w:t xml:space="preserve">para todos los roles</w:t>
+            </w:r>
+          </w:p>
+        </w:tc>
+      </w:tr>
+      <w:tr>
+        <w:tc>
+          <w:tcPr/>
+          <w:p>
+            <w:pPr>
+              <w:pStyle w:val="Compact"/>
+              <w:jc w:val="left"/>
+            </w:pPr>
+            <w:r>
+              <w:t xml:space="preserve">LAV-N09</w:t>
+            </w:r>
+          </w:p>
+        </w:tc>
+        <w:tc>
+          <w:tcPr/>
+          <w:p>
+            <w:pPr>
+              <w:pStyle w:val="Compact"/>
+              <w:jc w:val="left"/>
+            </w:pPr>
+            <w:r>
+              <w:t xml:space="preserve">🟡</w:t>
+            </w:r>
+          </w:p>
+        </w:tc>
+        <w:tc>
+          <w:tcPr/>
+          <w:p>
+            <w:pPr>
+              <w:pStyle w:val="Compact"/>
+              <w:jc w:val="left"/>
+            </w:pPr>
+            <w:r>
+              <w:t xml:space="preserve">El router reescribe la IP de origen: los limites por IP son globales</w:t>
+            </w:r>
+          </w:p>
+        </w:tc>
+        <w:tc>
+          <w:tcPr/>
+          <w:p>
+            <w:pPr>
+              <w:pStyle w:val="Compact"/>
+              <w:jc w:val="left"/>
+            </w:pPr>
+            <w:r>
+              <w:t xml:space="preserve">Reenvio sin SNAT o proxy de borde; captcha en el registro</w:t>
+            </w:r>
+          </w:p>
+        </w:tc>
+      </w:tr>
+      <w:tr>
+        <w:tc>
+          <w:tcPr/>
+          <w:p>
+            <w:pPr>
+              <w:pStyle w:val="Compact"/>
+              <w:jc w:val="left"/>
+            </w:pPr>
+            <w:r>
+              <w:t xml:space="preserve">LAV-N10</w:t>
+            </w:r>
+          </w:p>
+        </w:tc>
+        <w:tc>
+          <w:tcPr/>
+          <w:p>
+            <w:pPr>
+              <w:pStyle w:val="Compact"/>
+              <w:jc w:val="left"/>
+            </w:pPr>
+            <w:r>
+              <w:t xml:space="preserve">🟡</w:t>
+            </w:r>
+          </w:p>
+        </w:tc>
+        <w:tc>
+          <w:tcPr/>
+          <w:p>
+            <w:pPr>
+              <w:pStyle w:val="Compact"/>
+              <w:jc w:val="left"/>
+            </w:pPr>
+            <w:r>
+              <w:t xml:space="preserve">Un lavador puede crear reservas para cualquier cliente y listar vehiculos de todos</w:t>
+            </w:r>
+          </w:p>
+        </w:tc>
+        <w:tc>
+          <w:tcPr/>
+          <w:p>
+            <w:pPr>
+              <w:pStyle w:val="Compact"/>
+              <w:jc w:val="left"/>
+            </w:pPr>
+            <w:r>
+              <w:t xml:space="preserve">Restringir roles en esas rutas</w:t>
+            </w:r>
+          </w:p>
+        </w:tc>
+      </w:tr>
+      <w:tr>
+        <w:tc>
+          <w:tcPr/>
+          <w:p>
+            <w:pPr>
+              <w:pStyle w:val="Compact"/>
+              <w:jc w:val="left"/>
+            </w:pPr>
+            <w:r>
+              <w:t xml:space="preserve">LAV-N11</w:t>
+            </w:r>
+          </w:p>
+        </w:tc>
+        <w:tc>
+          <w:tcPr/>
+          <w:p>
+            <w:pPr>
+              <w:pStyle w:val="Compact"/>
+              <w:jc w:val="left"/>
+            </w:pPr>
+            <w:r>
+              <w:t xml:space="preserve">🔵</w:t>
+            </w:r>
+          </w:p>
+        </w:tc>
+        <w:tc>
+          <w:tcPr/>
+          <w:p>
+            <w:pPr>
+              <w:pStyle w:val="Compact"/>
+              <w:jc w:val="left"/>
+            </w:pPr>
+            <w:r>
+              <w:t xml:space="preserve">El cupo mensual del plan cuenta reservas de meses futuros</w:t>
+            </w:r>
+          </w:p>
+        </w:tc>
+        <w:tc>
+          <w:tcPr/>
+          <w:p>
+            <w:pPr>
+              <w:pStyle w:val="Compact"/>
+              <w:jc w:val="left"/>
+            </w:pPr>
+            <w:r>
+              <w:t xml:space="preserve">Rango del mes cerrado</w:t>
+            </w:r>
+          </w:p>
+        </w:tc>
+      </w:tr>
+      <w:tr>
+        <w:tc>
+          <w:tcPr/>
+          <w:p>
+            <w:pPr>
+              <w:pStyle w:val="Compact"/>
+              <w:jc w:val="left"/>
+            </w:pPr>
+            <w:r>
+              <w:t xml:space="preserve">LAV-N12</w:t>
+            </w:r>
+          </w:p>
+        </w:tc>
+        <w:tc>
+          <w:tcPr/>
+          <w:p>
+            <w:pPr>
+              <w:pStyle w:val="Compact"/>
+              <w:jc w:val="left"/>
+            </w:pPr>
+            <w:r>
+              <w:t xml:space="preserve">🔵</w:t>
+            </w:r>
+          </w:p>
+        </w:tc>
+        <w:tc>
+          <w:tcPr/>
+          <w:p>
+            <w:pPr>
+              <w:pStyle w:val="Compact"/>
+              <w:jc w:val="left"/>
+            </w:pPr>
+            <w:r>
+              <w:t xml:space="preserve">Reservas simultaneas de franjas distintas chocan al generar el codigo</w:t>
+            </w:r>
+          </w:p>
+        </w:tc>
+        <w:tc>
+          <w:tcPr/>
+          <w:p>
+            <w:pPr>
+              <w:pStyle w:val="Compact"/>
+              <w:jc w:val="left"/>
+            </w:pPr>
+            <w:r>
+              <w:t xml:space="preserve">Secuencia de BD y reintento</w:t>
+            </w:r>
+          </w:p>
+        </w:tc>
+      </w:tr>
+      <w:tr>
+        <w:tc>
+          <w:tcPr/>
+          <w:p>
+            <w:pPr>
+              <w:pStyle w:val="Compact"/>
+              <w:jc w:val="left"/>
+            </w:pPr>
+            <w:r>
+              <w:t xml:space="preserve">LAV-N13</w:t>
+            </w:r>
+          </w:p>
+        </w:tc>
+        <w:tc>
+          <w:tcPr/>
+          <w:p>
+            <w:pPr>
+              <w:pStyle w:val="Compact"/>
+              <w:jc w:val="left"/>
+            </w:pPr>
+            <w:r>
+              <w:t xml:space="preserve">🔵</w:t>
+            </w:r>
+          </w:p>
+        </w:tc>
+        <w:tc>
+          <w:tcPr/>
+          <w:p>
+            <w:pPr>
+              <w:pStyle w:val="Compact"/>
+              <w:jc w:val="left"/>
+            </w:pPr>
+            <w:r>
+              <w:t xml:space="preserve">Refresh en</w:t>
+            </w:r>
+            <w:r>
+              <w:t xml:space="preserve"> </w:t>
+            </w:r>
+            <w:r>
+              <w:rPr>
+                <w:rStyle w:val="VerbatimChar"/>
+              </w:rPr>
+              <w:t xml:space="preserve">localStorage</w:t>
+            </w:r>
+            <w:r>
+              <w:t xml:space="preserve"> </w:t>
+            </w:r>
+            <w:r>
+              <w:t xml:space="preserve">y HTML sin CSP</w:t>
+            </w:r>
+          </w:p>
+        </w:tc>
+        <w:tc>
+          <w:tcPr/>
+          <w:p>
+            <w:pPr>
+              <w:pStyle w:val="Compact"/>
+              <w:jc w:val="left"/>
+            </w:pPr>
+            <w:r>
+              <w:t xml:space="preserve">CSP en nginx; a futuro cookie httpOnly</w:t>
+            </w:r>
+          </w:p>
+        </w:tc>
+      </w:tr>
+      <w:tr>
+        <w:tc>
+          <w:tcPr/>
+          <w:p>
+            <w:pPr>
+              <w:pStyle w:val="Compact"/>
+              <w:jc w:val="left"/>
+            </w:pPr>
+            <w:r>
+              <w:t xml:space="preserve">LAV-N14</w:t>
+            </w:r>
+          </w:p>
+        </w:tc>
+        <w:tc>
+          <w:tcPr/>
+          <w:p>
+            <w:pPr>
+              <w:pStyle w:val="Compact"/>
+              <w:jc w:val="left"/>
+            </w:pPr>
+            <w:r>
+              <w:t xml:space="preserve">🔵</w:t>
+            </w:r>
+          </w:p>
+        </w:tc>
+        <w:tc>
+          <w:tcPr/>
+          <w:p>
+            <w:pPr>
+              <w:pStyle w:val="Compact"/>
+              <w:jc w:val="left"/>
+            </w:pPr>
+            <w:r>
+              <w:t xml:space="preserve">Logs del backend sin persistencia ni IP</w:t>
+            </w:r>
+          </w:p>
+        </w:tc>
+        <w:tc>
+          <w:tcPr/>
+          <w:p>
+            <w:pPr>
+              <w:pStyle w:val="Compact"/>
+              <w:jc w:val="left"/>
+            </w:pPr>
+            <w:r>
+              <w:t xml:space="preserve">Rotacion o volumen; registrar usuario e IP real</w:t>
+            </w:r>
+          </w:p>
+        </w:tc>
+      </w:tr>
+      <w:tr>
+        <w:tc>
+          <w:tcPr/>
+          <w:p>
+            <w:pPr>
+              <w:pStyle w:val="Compact"/>
+              <w:jc w:val="left"/>
+            </w:pPr>
+            <w:r>
+              <w:t xml:space="preserve">LAV-N15</w:t>
+            </w:r>
+          </w:p>
+        </w:tc>
+        <w:tc>
+          <w:tcPr/>
+          <w:p>
+            <w:pPr>
+              <w:pStyle w:val="Compact"/>
+              <w:jc w:val="left"/>
+            </w:pPr>
+            <w:r>
+              <w:t xml:space="preserve">🔵</w:t>
+            </w:r>
+          </w:p>
+        </w:tc>
+        <w:tc>
+          <w:tcPr/>
+          <w:p>
+            <w:pPr>
+              <w:pStyle w:val="Compact"/>
+              <w:jc w:val="left"/>
+            </w:pPr>
+            <w:r>
+              <w:t xml:space="preserve">Dependencias vulnerables (express/qs, nodemailer, axios, y ~100 de build por CRA)</w:t>
+            </w:r>
+          </w:p>
+        </w:tc>
+        <w:tc>
+          <w:tcPr/>
+          <w:p>
+            <w:pPr>
+              <w:pStyle w:val="Compact"/>
+              <w:jc w:val="left"/>
+            </w:pPr>
+            <w:r>
+              <w:rPr>
+                <w:rStyle w:val="VerbatimChar"/>
+              </w:rPr>
+              <w:t xml:space="preserve">npm audit fix</w:t>
+            </w:r>
+            <w:r>
+              <w:t xml:space="preserve"> </w:t>
+            </w:r>
+            <w:r>
+              <w:t xml:space="preserve">sin</w:t>
+            </w:r>
+            <w:r>
+              <w:t xml:space="preserve"> </w:t>
+            </w:r>
+            <w:r>
+              <w:rPr>
+                <w:rStyle w:val="VerbatimChar"/>
+              </w:rPr>
+              <w:t xml:space="preserve">--force</w:t>
+            </w:r>
+            <w:r>
+              <w:t xml:space="preserve">, subir axios, migrar a Vite</w:t>
             </w:r>
           </w:p>
         </w:tc>
       </w:tr>
     </w:tbl>
+    <w:bookmarkEnd w:id="43"/>
+    <w:bookmarkStart w:id="44" w:name="mejoras-sugeridas-priorizadas"/>
+    <w:p>
+      <w:pPr>
+        <w:pStyle w:val="Heading3"/>
+      </w:pPr>
+      <w:r>
+        <w:rPr>
+          <w:rStyle w:val="SectionNumber"/>
+        </w:rPr>
+        <w:t xml:space="preserve">0.18.4</w:t>
+      </w:r>
+      <w:r>
+        <w:tab/>
+      </w:r>
+      <w:r>
+        <w:t xml:space="preserve">Mejoras sugeridas (priorizadas)</w:t>
+      </w:r>
+    </w:p>
+    <w:tbl>
+      <w:tblPr>
+        <w:tblStyle w:val="Table"/>
+        <w:tblW w:type="pct" w:w="5000"/>
+        <w:jc w:val="left"/>
+        <w:tblLayout w:type="fixed"/>
+        <w:tblLook w:firstRow="1" w:lastRow="0" w:firstColumn="0" w:lastColumn="0" w:noHBand="0" w:noVBand="0" w:val="0020"/>
+      </w:tblPr>
+      <w:tblGrid>
+        <w:gridCol w:w="1980"/>
+        <w:gridCol w:w="1980"/>
+        <w:gridCol w:w="1980"/>
+        <w:gridCol w:w="1980"/>
+      </w:tblGrid>
+      <w:tr>
+        <w:trPr>
+          <w:tblHeader w:val="on"/>
+        </w:trPr>
+        <w:tc>
+          <w:tcPr/>
+          <w:p>
+            <w:pPr>
+              <w:pStyle w:val="Compact"/>
+              <w:jc w:val="left"/>
+            </w:pPr>
+            <w:r>
+              <w:t xml:space="preserve">#</w:t>
+            </w:r>
+          </w:p>
+        </w:tc>
+        <w:tc>
+          <w:tcPr/>
+          <w:p>
+            <w:pPr>
+              <w:pStyle w:val="Compact"/>
+              <w:jc w:val="left"/>
+            </w:pPr>
+            <w:r>
+              <w:t xml:space="preserve">Sugerencia</w:t>
+            </w:r>
+          </w:p>
+        </w:tc>
+        <w:tc>
+          <w:tcPr/>
+          <w:p>
+            <w:pPr>
+              <w:pStyle w:val="Compact"/>
+              <w:jc w:val="left"/>
+            </w:pPr>
+            <w:r>
+              <w:t xml:space="preserve">Esfuerzo</w:t>
+            </w:r>
+          </w:p>
+        </w:tc>
+        <w:tc>
+          <w:tcPr/>
+          <w:p>
+            <w:pPr>
+              <w:pStyle w:val="Compact"/>
+              <w:jc w:val="left"/>
+            </w:pPr>
+            <w:r>
+              <w:t xml:space="preserve">Valor</w:t>
+            </w:r>
+          </w:p>
+        </w:tc>
+      </w:tr>
+      <w:tr>
+        <w:tc>
+          <w:tcPr/>
+          <w:p>
+            <w:pPr>
+              <w:pStyle w:val="Compact"/>
+              <w:jc w:val="left"/>
+            </w:pPr>
+            <w:r>
+              <w:t xml:space="preserve">1</w:t>
+            </w:r>
+          </w:p>
+        </w:tc>
+        <w:tc>
+          <w:tcPr/>
+          <w:p>
+            <w:pPr>
+              <w:pStyle w:val="Compact"/>
+              <w:jc w:val="left"/>
+            </w:pPr>
+            <w:r>
+              <w:t xml:space="preserve">Rotar credenciales, cerrar 5437, repo privado, apagar webhook y tarjeta (LAV-N01/N02)</w:t>
+            </w:r>
+          </w:p>
+        </w:tc>
+        <w:tc>
+          <w:tcPr/>
+          <w:p>
+            <w:pPr>
+              <w:pStyle w:val="Compact"/>
+              <w:jc w:val="left"/>
+            </w:pPr>
+            <w:r>
+              <w:t xml:space="preserve">S</w:t>
+            </w:r>
+          </w:p>
+        </w:tc>
+        <w:tc>
+          <w:tcPr/>
+          <w:p>
+            <w:pPr>
+              <w:pStyle w:val="Compact"/>
+              <w:jc w:val="left"/>
+            </w:pPr>
+            <w:r>
+              <w:t xml:space="preserve">Muy alto</w:t>
+            </w:r>
+          </w:p>
+        </w:tc>
+      </w:tr>
+      <w:tr>
+        <w:tc>
+          <w:tcPr/>
+          <w:p>
+            <w:pPr>
+              <w:pStyle w:val="Compact"/>
+              <w:jc w:val="left"/>
+            </w:pPr>
+            <w:r>
+              <w:t xml:space="preserve">2</w:t>
+            </w:r>
+          </w:p>
+        </w:tc>
+        <w:tc>
+          <w:tcPr/>
+          <w:p>
+            <w:pPr>
+              <w:pStyle w:val="Compact"/>
+              <w:jc w:val="left"/>
+            </w:pPr>
+            <w:r>
+              <w:t xml:space="preserve">Subidas de mas de 1 MB y compresion en el cliente (LAV-N03)</w:t>
+            </w:r>
+          </w:p>
+        </w:tc>
+        <w:tc>
+          <w:tcPr/>
+          <w:p>
+            <w:pPr>
+              <w:pStyle w:val="Compact"/>
+              <w:jc w:val="left"/>
+            </w:pPr>
+            <w:r>
+              <w:t xml:space="preserve">S</w:t>
+            </w:r>
+          </w:p>
+        </w:tc>
+        <w:tc>
+          <w:tcPr/>
+          <w:p>
+            <w:pPr>
+              <w:pStyle w:val="Compact"/>
+              <w:jc w:val="left"/>
+            </w:pPr>
+            <w:r>
+              <w:t xml:space="preserve">Muy alto</w:t>
+            </w:r>
+          </w:p>
+        </w:tc>
+      </w:tr>
+      <w:tr>
+        <w:tc>
+          <w:tcPr/>
+          <w:p>
+            <w:pPr>
+              <w:pStyle w:val="Compact"/>
+              <w:jc w:val="left"/>
+            </w:pPr>
+            <w:r>
+              <w:t xml:space="preserve">3</w:t>
+            </w:r>
+          </w:p>
+        </w:tc>
+        <w:tc>
+          <w:tcPr/>
+          <w:p>
+            <w:pPr>
+              <w:pStyle w:val="Compact"/>
+              <w:jc w:val="left"/>
+            </w:pPr>
+            <w:r>
+              <w:t xml:space="preserve">Retencion mensual, copia externa cifrada y alerta si falta un respaldo</w:t>
+            </w:r>
+          </w:p>
+        </w:tc>
+        <w:tc>
+          <w:tcPr/>
+          <w:p>
+            <w:pPr>
+              <w:pStyle w:val="Compact"/>
+              <w:jc w:val="left"/>
+            </w:pPr>
+            <w:r>
+              <w:t xml:space="preserve">S-M</w:t>
+            </w:r>
+          </w:p>
+        </w:tc>
+        <w:tc>
+          <w:tcPr/>
+          <w:p>
+            <w:pPr>
+              <w:pStyle w:val="Compact"/>
+              <w:jc w:val="left"/>
+            </w:pPr>
+            <w:r>
+              <w:t xml:space="preserve">Alto</w:t>
+            </w:r>
+          </w:p>
+        </w:tc>
+      </w:tr>
+      <w:tr>
+        <w:tc>
+          <w:tcPr/>
+          <w:p>
+            <w:pPr>
+              <w:pStyle w:val="Compact"/>
+              <w:jc w:val="left"/>
+            </w:pPr>
+            <w:r>
+              <w:t xml:space="preserve">4</w:t>
+            </w:r>
+          </w:p>
+        </w:tc>
+        <w:tc>
+          <w:tcPr/>
+          <w:p>
+            <w:pPr>
+              <w:pStyle w:val="Compact"/>
+              <w:jc w:val="left"/>
+            </w:pPr>
+            <w:r>
+              <w:t xml:space="preserve">Swagger solo fuera de produccion, 3042 en</w:t>
+            </w:r>
+            <w:r>
+              <w:t xml:space="preserve"> </w:t>
+            </w:r>
+            <w:r>
+              <w:rPr>
+                <w:rStyle w:val="VerbatimChar"/>
+              </w:rPr>
+              <w:t xml:space="preserve">127.0.0.1</w:t>
+            </w:r>
+            <w:r>
+              <w:t xml:space="preserve">,</w:t>
+            </w:r>
+            <w:r>
+              <w:t xml:space="preserve"> </w:t>
+            </w:r>
+            <w:r>
+              <w:rPr>
+                <w:rStyle w:val="VerbatimChar"/>
+              </w:rPr>
+              <w:t xml:space="preserve">CORS_ORIGINS</w:t>
+            </w:r>
+          </w:p>
+        </w:tc>
+        <w:tc>
+          <w:tcPr/>
+          <w:p>
+            <w:pPr>
+              <w:pStyle w:val="Compact"/>
+              <w:jc w:val="left"/>
+            </w:pPr>
+            <w:r>
+              <w:t xml:space="preserve">S</w:t>
+            </w:r>
+          </w:p>
+        </w:tc>
+        <w:tc>
+          <w:tcPr/>
+          <w:p>
+            <w:pPr>
+              <w:pStyle w:val="Compact"/>
+              <w:jc w:val="left"/>
+            </w:pPr>
+            <w:r>
+              <w:t xml:space="preserve">Alto</w:t>
+            </w:r>
+          </w:p>
+        </w:tc>
+      </w:tr>
+      <w:tr>
+        <w:tc>
+          <w:tcPr/>
+          <w:p>
+            <w:pPr>
+              <w:pStyle w:val="Compact"/>
+              <w:jc w:val="left"/>
+            </w:pPr>
+            <w:r>
+              <w:t xml:space="preserve">5</w:t>
+            </w:r>
+          </w:p>
+        </w:tc>
+        <w:tc>
+          <w:tcPr/>
+          <w:p>
+            <w:pPr>
+              <w:pStyle w:val="Compact"/>
+              <w:jc w:val="left"/>
+            </w:pPr>
+            <w:r>
+              <w:t xml:space="preserve">Cuadre de caja: rangos en</w:t>
+            </w:r>
+            <w:r>
+              <w:t xml:space="preserve"> </w:t>
+            </w:r>
+            <w:r>
+              <w:t xml:space="preserve">“</w:t>
+            </w:r>
+            <w:r>
+              <w:t xml:space="preserve">cobrado</w:t>
+            </w:r>
+            <w:r>
+              <w:t xml:space="preserve">”</w:t>
+            </w:r>
+            <w:r>
+              <w:t xml:space="preserve">, resumen del periodo, un criterio de estados (LAV-N04/N06/N07)</w:t>
+            </w:r>
+          </w:p>
+        </w:tc>
+        <w:tc>
+          <w:tcPr/>
+          <w:p>
+            <w:pPr>
+              <w:pStyle w:val="Compact"/>
+              <w:jc w:val="left"/>
+            </w:pPr>
+            <w:r>
+              <w:t xml:space="preserve">S</w:t>
+            </w:r>
+          </w:p>
+        </w:tc>
+        <w:tc>
+          <w:tcPr/>
+          <w:p>
+            <w:pPr>
+              <w:pStyle w:val="Compact"/>
+              <w:jc w:val="left"/>
+            </w:pPr>
+            <w:r>
+              <w:t xml:space="preserve">Alto</w:t>
+            </w:r>
+          </w:p>
+        </w:tc>
+      </w:tr>
+      <w:tr>
+        <w:tc>
+          <w:tcPr/>
+          <w:p>
+            <w:pPr>
+              <w:pStyle w:val="Compact"/>
+              <w:jc w:val="left"/>
+            </w:pPr>
+            <w:r>
+              <w:t xml:space="preserve">6</w:t>
+            </w:r>
+          </w:p>
+        </w:tc>
+        <w:tc>
+          <w:tcPr/>
+          <w:p>
+            <w:pPr>
+              <w:pStyle w:val="Compact"/>
+              <w:jc w:val="left"/>
+            </w:pPr>
+            <w:r>
+              <w:t xml:space="preserve">Boton</w:t>
+            </w:r>
+            <w:r>
+              <w:t xml:space="preserve"> </w:t>
+            </w:r>
+            <w:r>
+              <w:t xml:space="preserve">“</w:t>
+            </w:r>
+            <w:r>
+              <w:t xml:space="preserve">No asistio</w:t>
+            </w:r>
+            <w:r>
+              <w:t xml:space="preserve">”</w:t>
+            </w:r>
+            <w:r>
+              <w:t xml:space="preserve"> </w:t>
+            </w:r>
+            <w:r>
+              <w:t xml:space="preserve">y cierre nocturno de reservas vencidas</w:t>
+            </w:r>
+          </w:p>
+        </w:tc>
+        <w:tc>
+          <w:tcPr/>
+          <w:p>
+            <w:pPr>
+              <w:pStyle w:val="Compact"/>
+              <w:jc w:val="left"/>
+            </w:pPr>
+            <w:r>
+              <w:t xml:space="preserve">S</w:t>
+            </w:r>
+          </w:p>
+        </w:tc>
+        <w:tc>
+          <w:tcPr/>
+          <w:p>
+            <w:pPr>
+              <w:pStyle w:val="Compact"/>
+              <w:jc w:val="left"/>
+            </w:pPr>
+            <w:r>
+              <w:t xml:space="preserve">Alto</w:t>
+            </w:r>
+          </w:p>
+        </w:tc>
+      </w:tr>
+      <w:tr>
+        <w:tc>
+          <w:tcPr/>
+          <w:p>
+            <w:pPr>
+              <w:pStyle w:val="Compact"/>
+              <w:jc w:val="left"/>
+            </w:pPr>
+            <w:r>
+              <w:t xml:space="preserve">7</w:t>
+            </w:r>
+          </w:p>
+        </w:tc>
+        <w:tc>
+          <w:tcPr/>
+          <w:p>
+            <w:pPr>
+              <w:pStyle w:val="Compact"/>
+              <w:jc w:val="left"/>
+            </w:pPr>
+            <w:r>
+              <w:t xml:space="preserve">Precios de moto y catalogo de adicionales</w:t>
+            </w:r>
+          </w:p>
+        </w:tc>
+        <w:tc>
+          <w:tcPr/>
+          <w:p>
+            <w:pPr>
+              <w:pStyle w:val="Compact"/>
+              <w:jc w:val="left"/>
+            </w:pPr>
+            <w:r>
+              <w:t xml:space="preserve">S</w:t>
+            </w:r>
+          </w:p>
+        </w:tc>
+        <w:tc>
+          <w:tcPr/>
+          <w:p>
+            <w:pPr>
+              <w:pStyle w:val="Compact"/>
+              <w:jc w:val="left"/>
+            </w:pPr>
+            <w:r>
+              <w:t xml:space="preserve">Alto</w:t>
+            </w:r>
+          </w:p>
+        </w:tc>
+      </w:tr>
+      <w:tr>
+        <w:tc>
+          <w:tcPr/>
+          <w:p>
+            <w:pPr>
+              <w:pStyle w:val="Compact"/>
+              <w:jc w:val="left"/>
+            </w:pPr>
+            <w:r>
+              <w:t xml:space="preserve">8</w:t>
+            </w:r>
+          </w:p>
+        </w:tc>
+        <w:tc>
+          <w:tcPr/>
+          <w:p>
+            <w:pPr>
+              <w:pStyle w:val="Compact"/>
+              <w:jc w:val="left"/>
+            </w:pPr>
+            <w:r>
+              <w:t xml:space="preserve">SMTP y recordatorios por el gateway WhatsApp propio en lugar de Twilio</w:t>
+            </w:r>
+          </w:p>
+        </w:tc>
+        <w:tc>
+          <w:tcPr/>
+          <w:p>
+            <w:pPr>
+              <w:pStyle w:val="Compact"/>
+              <w:jc w:val="left"/>
+            </w:pPr>
+            <w:r>
+              <w:t xml:space="preserve">M</w:t>
+            </w:r>
+          </w:p>
+        </w:tc>
+        <w:tc>
+          <w:tcPr/>
+          <w:p>
+            <w:pPr>
+              <w:pStyle w:val="Compact"/>
+              <w:jc w:val="left"/>
+            </w:pPr>
+            <w:r>
+              <w:t xml:space="preserve">Alto</w:t>
+            </w:r>
+          </w:p>
+        </w:tc>
+      </w:tr>
+      <w:tr>
+        <w:tc>
+          <w:tcPr/>
+          <w:p>
+            <w:pPr>
+              <w:pStyle w:val="Compact"/>
+              <w:jc w:val="left"/>
+            </w:pPr>
+            <w:r>
+              <w:t xml:space="preserve">9</w:t>
+            </w:r>
+          </w:p>
+        </w:tc>
+        <w:tc>
+          <w:tcPr/>
+          <w:p>
+            <w:pPr>
+              <w:pStyle w:val="Compact"/>
+              <w:jc w:val="left"/>
+            </w:pPr>
+            <w:r>
+              <w:t xml:space="preserve">“</w:t>
+            </w:r>
+            <w:r>
+              <w:t xml:space="preserve">Cambiar mi contrasena</w:t>
+            </w:r>
+            <w:r>
+              <w:t xml:space="preserve">”</w:t>
+            </w:r>
+            <w:r>
+              <w:t xml:space="preserve"> </w:t>
+            </w:r>
+            <w:r>
+              <w:t xml:space="preserve">y politica minima (LAV-N08)</w:t>
+            </w:r>
+          </w:p>
+        </w:tc>
+        <w:tc>
+          <w:tcPr/>
+          <w:p>
+            <w:pPr>
+              <w:pStyle w:val="Compact"/>
+              <w:jc w:val="left"/>
+            </w:pPr>
+            <w:r>
+              <w:t xml:space="preserve">S-M</w:t>
+            </w:r>
+          </w:p>
+        </w:tc>
+        <w:tc>
+          <w:tcPr/>
+          <w:p>
+            <w:pPr>
+              <w:pStyle w:val="Compact"/>
+              <w:jc w:val="left"/>
+            </w:pPr>
+            <w:r>
+              <w:t xml:space="preserve">Medio-alto</w:t>
+            </w:r>
+          </w:p>
+        </w:tc>
+      </w:tr>
+      <w:tr>
+        <w:tc>
+          <w:tcPr/>
+          <w:p>
+            <w:pPr>
+              <w:pStyle w:val="Compact"/>
+              <w:jc w:val="left"/>
+            </w:pPr>
+            <w:r>
+              <w:t xml:space="preserve">10</w:t>
+            </w:r>
+          </w:p>
+        </w:tc>
+        <w:tc>
+          <w:tcPr/>
+          <w:p>
+            <w:pPr>
+              <w:pStyle w:val="Compact"/>
+              <w:jc w:val="left"/>
+            </w:pPr>
+            <w:r>
+              <w:t xml:space="preserve">Fidelizacion: sellos, referidos, recordatorio a los 30 dias, calificacion por WhatsApp</w:t>
+            </w:r>
+          </w:p>
+        </w:tc>
+        <w:tc>
+          <w:tcPr/>
+          <w:p>
+            <w:pPr>
+              <w:pStyle w:val="Compact"/>
+              <w:jc w:val="left"/>
+            </w:pPr>
+            <w:r>
+              <w:t xml:space="preserve">M</w:t>
+            </w:r>
+          </w:p>
+        </w:tc>
+        <w:tc>
+          <w:tcPr/>
+          <w:p>
+            <w:pPr>
+              <w:pStyle w:val="Compact"/>
+              <w:jc w:val="left"/>
+            </w:pPr>
+            <w:r>
+              <w:t xml:space="preserve">Alto</w:t>
+            </w:r>
+          </w:p>
+        </w:tc>
+      </w:tr>
+      <w:tr>
+        <w:tc>
+          <w:tcPr/>
+          <w:p>
+            <w:pPr>
+              <w:pStyle w:val="Compact"/>
+              <w:jc w:val="left"/>
+            </w:pPr>
+            <w:r>
+              <w:t xml:space="preserve">11</w:t>
+            </w:r>
+          </w:p>
+        </w:tc>
+        <w:tc>
+          <w:tcPr/>
+          <w:p>
+            <w:pPr>
+              <w:pStyle w:val="Compact"/>
+              <w:jc w:val="left"/>
+            </w:pPr>
+            <w:r>
+              <w:t xml:space="preserve">Pago por QR/transferencia antes que tarjeta; luego pasarela local con webhook firmado</w:t>
+            </w:r>
+          </w:p>
+        </w:tc>
+        <w:tc>
+          <w:tcPr/>
+          <w:p>
+            <w:pPr>
+              <w:pStyle w:val="Compact"/>
+              <w:jc w:val="left"/>
+            </w:pPr>
+            <w:r>
+              <w:t xml:space="preserve">M-L</w:t>
+            </w:r>
+          </w:p>
+        </w:tc>
+        <w:tc>
+          <w:tcPr/>
+          <w:p>
+            <w:pPr>
+              <w:pStyle w:val="Compact"/>
+              <w:jc w:val="left"/>
+            </w:pPr>
+            <w:r>
+              <w:t xml:space="preserve">Alto</w:t>
+            </w:r>
+          </w:p>
+        </w:tc>
+      </w:tr>
+      <w:tr>
+        <w:tc>
+          <w:tcPr/>
+          <w:p>
+            <w:pPr>
+              <w:pStyle w:val="Compact"/>
+              <w:jc w:val="left"/>
+            </w:pPr>
+            <w:r>
+              <w:t xml:space="preserve">12</w:t>
+            </w:r>
+          </w:p>
+        </w:tc>
+        <w:tc>
+          <w:tcPr/>
+          <w:p>
+            <w:pPr>
+              <w:pStyle w:val="Compact"/>
+              <w:jc w:val="left"/>
+            </w:pPr>
+            <w:r>
+              <w:t xml:space="preserve">Healthchecks con</w:t>
+            </w:r>
+            <w:r>
+              <w:t xml:space="preserve"> </w:t>
+            </w:r>
+            <w:r>
+              <w:rPr>
+                <w:rStyle w:val="VerbatimChar"/>
+              </w:rPr>
+              <w:t xml:space="preserve">depends_on: service_healthy</w:t>
+            </w:r>
+            <w:r>
+              <w:t xml:space="preserve"> </w:t>
+            </w:r>
+            <w:r>
+              <w:t xml:space="preserve">y logs con rotacion</w:t>
+            </w:r>
+          </w:p>
+        </w:tc>
+        <w:tc>
+          <w:tcPr/>
+          <w:p>
+            <w:pPr>
+              <w:pStyle w:val="Compact"/>
+              <w:jc w:val="left"/>
+            </w:pPr>
+            <w:r>
+              <w:t xml:space="preserve">S</w:t>
+            </w:r>
+          </w:p>
+        </w:tc>
+        <w:tc>
+          <w:tcPr/>
+          <w:p>
+            <w:pPr>
+              <w:pStyle w:val="Compact"/>
+              <w:jc w:val="left"/>
+            </w:pPr>
+            <w:r>
+              <w:t xml:space="preserve">Medio</w:t>
+            </w:r>
+          </w:p>
+        </w:tc>
+      </w:tr>
+      <w:tr>
+        <w:tc>
+          <w:tcPr/>
+          <w:p>
+            <w:pPr>
+              <w:pStyle w:val="Compact"/>
+              <w:jc w:val="left"/>
+            </w:pPr>
+            <w:r>
+              <w:t xml:space="preserve">13</w:t>
+            </w:r>
+          </w:p>
+        </w:tc>
+        <w:tc>
+          <w:tcPr/>
+          <w:p>
+            <w:pPr>
+              <w:pStyle w:val="Compact"/>
+              <w:jc w:val="left"/>
+            </w:pPr>
+            <w:r>
+              <w:t xml:space="preserve">Roles por ruta,</w:t>
+            </w:r>
+            <w:r>
+              <w:t xml:space="preserve"> </w:t>
+            </w:r>
+            <w:r>
+              <w:rPr>
+                <w:rStyle w:val="VerbatimChar"/>
+              </w:rPr>
+              <w:t xml:space="preserve">rol</w:t>
+            </w:r>
+            <w:r>
+              <w:t xml:space="preserve"> </w:t>
+            </w:r>
+            <w:r>
+              <w:t xml:space="preserve">como enum, tope de rango en exportaciones</w:t>
+            </w:r>
+          </w:p>
+        </w:tc>
+        <w:tc>
+          <w:tcPr/>
+          <w:p>
+            <w:pPr>
+              <w:pStyle w:val="Compact"/>
+              <w:jc w:val="left"/>
+            </w:pPr>
+            <w:r>
+              <w:t xml:space="preserve">S-M</w:t>
+            </w:r>
+          </w:p>
+        </w:tc>
+        <w:tc>
+          <w:tcPr/>
+          <w:p>
+            <w:pPr>
+              <w:pStyle w:val="Compact"/>
+              <w:jc w:val="left"/>
+            </w:pPr>
+            <w:r>
+              <w:t xml:space="preserve">Medio</w:t>
+            </w:r>
+          </w:p>
+        </w:tc>
+      </w:tr>
+      <w:tr>
+        <w:tc>
+          <w:tcPr/>
+          <w:p>
+            <w:pPr>
+              <w:pStyle w:val="Compact"/>
+              <w:jc w:val="left"/>
+            </w:pPr>
+            <w:r>
+              <w:t xml:space="preserve">14</w:t>
+            </w:r>
+          </w:p>
+        </w:tc>
+        <w:tc>
+          <w:tcPr/>
+          <w:p>
+            <w:pPr>
+              <w:pStyle w:val="Compact"/>
+              <w:jc w:val="left"/>
+            </w:pPr>
+            <w:r>
+              <w:t xml:space="preserve">Migrar de CRA a Vite</w:t>
+            </w:r>
+          </w:p>
+        </w:tc>
+        <w:tc>
+          <w:tcPr/>
+          <w:p>
+            <w:pPr>
+              <w:pStyle w:val="Compact"/>
+              <w:jc w:val="left"/>
+            </w:pPr>
+            <w:r>
+              <w:t xml:space="preserve">M</w:t>
+            </w:r>
+          </w:p>
+        </w:tc>
+        <w:tc>
+          <w:tcPr/>
+          <w:p>
+            <w:pPr>
+              <w:pStyle w:val="Compact"/>
+              <w:jc w:val="left"/>
+            </w:pPr>
+            <w:r>
+              <w:t xml:space="preserve">Medio</w:t>
+            </w:r>
+          </w:p>
+        </w:tc>
+      </w:tr>
+    </w:tbl>
+    <w:bookmarkEnd w:id="44"/>
+    <w:bookmarkStart w:id="45" w:name="no-verificado"/>
+    <w:p>
+      <w:pPr>
+        <w:pStyle w:val="Heading3"/>
+      </w:pPr>
+      <w:r>
+        <w:rPr>
+          <w:rStyle w:val="SectionNumber"/>
+        </w:rPr>
+        <w:t xml:space="preserve">0.18.5</w:t>
+      </w:r>
+      <w:r>
+        <w:tab/>
+      </w:r>
+      <w:r>
+        <w:t xml:space="preserve">No verificado</w:t>
+      </w:r>
+    </w:p>
+    <w:p>
+      <w:pPr>
+        <w:pStyle w:val="FirstParagraph"/>
+      </w:pPr>
+      <w:r>
+        <w:t xml:space="preserve">Alcance desde Internet de 5437 y 3042 (requiere escaneo externo); LAV-N01 no se ejecuto</w:t>
+      </w:r>
+      <w:r>
+        <w:t xml:space="preserve"> </w:t>
+      </w:r>
+      <w:r>
+        <w:t xml:space="preserve">(sale de leer el codigo); no se corrio la suite Jest ni se probo una restauracion; no se</w:t>
+      </w:r>
+      <w:r>
+        <w:t xml:space="preserve"> </w:t>
+      </w:r>
+      <w:r>
+        <w:t xml:space="preserve">revisaron las cuentas demo ni el contenido de</w:t>
+      </w:r>
+      <w:r>
+        <w:t xml:space="preserve"> </w:t>
+      </w:r>
+      <w:r>
+        <w:rPr>
+          <w:rStyle w:val="VerbatimChar"/>
+        </w:rPr>
+        <w:t xml:space="preserve">HISTORIAL_CHAT.md</w:t>
+      </w:r>
+      <w:r>
+        <w:t xml:space="preserve"> </w:t>
+      </w:r>
+      <w:r>
+        <w:t xml:space="preserve">del repo publico.</w:t>
+      </w:r>
+    </w:p>
+    <w:p>
+      <w:r>
+        <w:pict>
+          <v:rect style="width:0;height:1.5pt" o:hralign="center" o:hrstd="t" o:hr="t"/>
+        </w:pict>
+      </w:r>
+    </w:p>
+    <w:bookmarkEnd w:id="45"/>
+    <w:bookmarkEnd w:id="46"/>
+    <w:bookmarkStart w:id="47" w:name="control-de-versiones"/>
+    <w:p>
+      <w:pPr>
+        <w:pStyle w:val="Heading2"/>
+      </w:pPr>
+      <w:r>
+        <w:rPr>
+          <w:rStyle w:val="SectionNumber"/>
+        </w:rPr>
+        <w:t xml:space="preserve">0.19</w:t>
+      </w:r>
+      <w:r>
+        <w:tab/>
+      </w:r>
+      <w:r>
+        <w:t xml:space="preserve">Control de versiones</w:t>
+      </w:r>
+    </w:p>
+    <w:tbl>
+      <w:tblPr>
+        <w:tblStyle w:val="Table"/>
+        <w:tblW w:type="pct" w:w="5000"/>
+        <w:jc w:val="left"/>
+        <w:tblLayout w:type="fixed"/>
+        <w:tblLook w:firstRow="1" w:lastRow="0" w:firstColumn="0" w:lastColumn="0" w:noHBand="0" w:noVBand="0" w:val="0020"/>
+      </w:tblPr>
+      <w:tblGrid>
+        <w:gridCol w:w="1980"/>
+        <w:gridCol w:w="1980"/>
+        <w:gridCol w:w="1980"/>
+        <w:gridCol w:w="1980"/>
+      </w:tblGrid>
+      <w:tr>
+        <w:trPr>
+          <w:tblHeader w:val="on"/>
+        </w:trPr>
+        <w:tc>
+          <w:tcPr/>
+          <w:p>
+            <w:pPr>
+              <w:pStyle w:val="Compact"/>
+              <w:jc w:val="left"/>
+            </w:pPr>
+            <w:r>
+              <w:t xml:space="preserve">Version</w:t>
+            </w:r>
+          </w:p>
+        </w:tc>
+        <w:tc>
+          <w:tcPr/>
+          <w:p>
+            <w:pPr>
+              <w:pStyle w:val="Compact"/>
+              <w:jc w:val="left"/>
+            </w:pPr>
+            <w:r>
+              <w:t xml:space="preserve">Fecha</w:t>
+            </w:r>
+          </w:p>
+        </w:tc>
+        <w:tc>
+          <w:tcPr/>
+          <w:p>
+            <w:pPr>
+              <w:pStyle w:val="Compact"/>
+              <w:jc w:val="left"/>
+            </w:pPr>
+            <w:r>
+              <w:t xml:space="preserve">Cambio</w:t>
+            </w:r>
+          </w:p>
+        </w:tc>
+        <w:tc>
+          <w:tcPr/>
+          <w:p>
+            <w:pPr>
+              <w:pStyle w:val="Compact"/>
+              <w:jc w:val="left"/>
+            </w:pPr>
+            <w:r>
+              <w:t xml:space="preserve">Responsable</w:t>
+            </w:r>
+          </w:p>
+        </w:tc>
+      </w:tr>
+      <w:tr>
+        <w:tc>
+          <w:tcPr/>
+          <w:p>
+            <w:pPr>
+              <w:pStyle w:val="Compact"/>
+              <w:jc w:val="left"/>
+            </w:pPr>
+            <w:r>
+              <w:t xml:space="preserve">1.1</w:t>
+            </w:r>
+          </w:p>
+        </w:tc>
+        <w:tc>
+          <w:tcPr/>
+          <w:p>
+            <w:pPr>
+              <w:pStyle w:val="Compact"/>
+              <w:jc w:val="left"/>
+            </w:pPr>
+            <w:r>
+              <w:t xml:space="preserve">2026-10-11</w:t>
+            </w:r>
+          </w:p>
+        </w:tc>
+        <w:tc>
+          <w:tcPr/>
+          <w:p>
+            <w:pPr>
+              <w:pStyle w:val="Compact"/>
+              <w:jc w:val="left"/>
+            </w:pPr>
+            <w:r>
+              <w:t xml:space="preserve">Emision inicial del documento.</w:t>
+            </w:r>
+          </w:p>
+        </w:tc>
+        <w:tc>
+          <w:tcPr/>
+          <w:p>
+            <w:pPr>
+              <w:pStyle w:val="Compact"/>
+              <w:jc w:val="left"/>
+            </w:pPr>
+            <w:r>
+              <w:t xml:space="preserve">Auditoria tecnica</w:t>
+            </w:r>
+          </w:p>
+        </w:tc>
+      </w:tr>
+    </w:tbl>
     <w:p>
       <w:pPr>
         <w:pStyle w:val="BodyText"/>
@@ -3778,7 +6621,7 @@
         <w:t xml:space="preserve">repositorio; la fuente es el archivo Markdown correspondiente.</w:t>
       </w:r>
     </w:p>
-    <w:bookmarkEnd w:id="41"/>
+    <w:bookmarkEnd w:id="47"/>
     <w:sectPr/>
   </w:body>
 </w:document>

</xml_diff>